<commit_message>
Emp ID generation bug fixes Navbar mnenu name fixes
</commit_message>
<xml_diff>
--- a/AssetManagement/Client/wwwroot/Private/ExpCertificateIPAI.docx
+++ b/AssetManagement/Client/wwwroot/Private/ExpCertificateIPAI.docx
@@ -146,21 +146,10 @@
         <w:rPr>
           <w:lang w:val="en-US"/>
         </w:rPr>
-        <w:t xml:space="preserve">IPAI TECHNOLOGIES SOLUTIONS </w:t>
-      </w:r>
-      <w:proofErr w:type="gramStart"/>
-      <w:r>
-        <w:rPr>
-          <w:lang w:val="en-US"/>
-        </w:rPr>
-        <w:t xml:space="preserve">LLP </w:t>
-      </w:r>
-      <w:r>
-        <w:t xml:space="preserve"> in</w:t>
-      </w:r>
-      <w:proofErr w:type="gramEnd"/>
-      <w:r>
-        <w:t xml:space="preserve"> the position of {Designation} from {DateOfJoining} to {DateOfLeaving}.</w:t>
+        <w:t xml:space="preserve">IPAI TECHNOLOGIES SOLUTIONS LLP </w:t>
+      </w:r>
+      <w:r>
+        <w:t>in the position of {Designation} from {DateOfJoining} to {DateOfLeaving}.</w:t>
       </w:r>
     </w:p>
     <w:p>
@@ -1380,21 +1369,6 @@
 </file>
 
 <file path=customXml/item1.xml><?xml version="1.0" encoding="utf-8"?>
-<p:properties xmlns:p="http://schemas.microsoft.com/office/2006/metadata/properties" xmlns:xsi="http://www.w3.org/2001/XMLSchema-instance" xmlns:pc="http://schemas.microsoft.com/office/infopath/2007/PartnerControls">
-  <documentManagement/>
-</p:properties>
-</file>
-
-<file path=customXml/item2.xml><?xml version="1.0" encoding="utf-8"?>
-<?mso-contentType ?>
-<FormTemplates xmlns="http://schemas.microsoft.com/sharepoint/v3/contenttype/forms">
-  <Display>DocumentLibraryForm</Display>
-  <Edit>DocumentLibraryForm</Edit>
-  <New>DocumentLibraryForm</New>
-</FormTemplates>
-</file>
-
-<file path=customXml/item3.xml><?xml version="1.0" encoding="utf-8"?>
 <ct:contentTypeSchema xmlns:ct="http://schemas.microsoft.com/office/2006/metadata/contentType" xmlns:ma="http://schemas.microsoft.com/office/2006/metadata/properties/metaAttributes" ct:_="" ma:_="" ma:contentTypeName="Document" ma:contentTypeID="0x01010064C668386D71254A9B846196BCFDEEBB" ma:contentTypeVersion="10" ma:contentTypeDescription="Create a new document." ma:contentTypeScope="" ma:versionID="dd503ad7b829dd49d23e710eb0d0952f">
   <xsd:schema xmlns:xsd="http://www.w3.org/2001/XMLSchema" xmlns:xs="http://www.w3.org/2001/XMLSchema" xmlns:p="http://schemas.microsoft.com/office/2006/metadata/properties" xmlns:ns3="a695923e-298e-4825-b9bd-6d009368478c" xmlns:ns4="aa0711ad-9178-42f7-ab40-fe5910d38b18" targetNamespace="http://schemas.microsoft.com/office/2006/metadata/properties" ma:root="true" ma:fieldsID="8f46111ec0ab06efff933e21322afef7" ns3:_="" ns4:_="">
     <xsd:import namespace="a695923e-298e-4825-b9bd-6d009368478c"/>
@@ -1597,24 +1571,22 @@
 </ct:contentTypeSchema>
 </file>
 
-<file path=customXml/itemProps1.xml><?xml version="1.0" encoding="utf-8"?>
-<ds:datastoreItem xmlns:ds="http://schemas.openxmlformats.org/officeDocument/2006/customXml" ds:itemID="{29BF7625-279A-44D4-A670-606FBD173230}">
-  <ds:schemaRefs>
-    <ds:schemaRef ds:uri="http://schemas.microsoft.com/office/2006/metadata/properties"/>
-    <ds:schemaRef ds:uri="http://schemas.microsoft.com/office/infopath/2007/PartnerControls"/>
-  </ds:schemaRefs>
-</ds:datastoreItem>
+<file path=customXml/item2.xml><?xml version="1.0" encoding="utf-8"?>
+<?mso-contentType ?>
+<FormTemplates xmlns="http://schemas.microsoft.com/sharepoint/v3/contenttype/forms">
+  <Display>DocumentLibraryForm</Display>
+  <Edit>DocumentLibraryForm</Edit>
+  <New>DocumentLibraryForm</New>
+</FormTemplates>
 </file>
 
-<file path=customXml/itemProps2.xml><?xml version="1.0" encoding="utf-8"?>
-<ds:datastoreItem xmlns:ds="http://schemas.openxmlformats.org/officeDocument/2006/customXml" ds:itemID="{4B349413-ACA7-44BA-A389-0B047207B532}">
-  <ds:schemaRefs>
-    <ds:schemaRef ds:uri="http://schemas.microsoft.com/sharepoint/v3/contenttype/forms"/>
-  </ds:schemaRefs>
-</ds:datastoreItem>
+<file path=customXml/item3.xml><?xml version="1.0" encoding="utf-8"?>
+<p:properties xmlns:p="http://schemas.microsoft.com/office/2006/metadata/properties" xmlns:xsi="http://www.w3.org/2001/XMLSchema-instance" xmlns:pc="http://schemas.microsoft.com/office/infopath/2007/PartnerControls">
+  <documentManagement/>
+</p:properties>
 </file>
 
-<file path=customXml/itemProps3.xml><?xml version="1.0" encoding="utf-8"?>
+<file path=customXml/itemProps1.xml><?xml version="1.0" encoding="utf-8"?>
 <ds:datastoreItem xmlns:ds="http://schemas.openxmlformats.org/officeDocument/2006/customXml" ds:itemID="{C02AB0FD-7D26-4D97-A333-23DC21F17D61}">
   <ds:schemaRefs>
     <ds:schemaRef ds:uri="http://schemas.microsoft.com/office/2006/metadata/contentType"/>
@@ -1631,4 +1603,21 @@
     <ds:schemaRef ds:uri="http://schemas.microsoft.com/internal/obd"/>
   </ds:schemaRefs>
 </ds:datastoreItem>
+</file>
+
+<file path=customXml/itemProps2.xml><?xml version="1.0" encoding="utf-8"?>
+<ds:datastoreItem xmlns:ds="http://schemas.openxmlformats.org/officeDocument/2006/customXml" ds:itemID="{4B349413-ACA7-44BA-A389-0B047207B532}">
+  <ds:schemaRefs>
+    <ds:schemaRef ds:uri="http://schemas.microsoft.com/sharepoint/v3/contenttype/forms"/>
+  </ds:schemaRefs>
+</ds:datastoreItem>
+</file>
+
+<file path=customXml/itemProps3.xml><?xml version="1.0" encoding="utf-8"?>
+<ds:datastoreItem xmlns:ds="http://schemas.openxmlformats.org/officeDocument/2006/customXml" ds:itemID="{29BF7625-279A-44D4-A670-606FBD173230}">
+  <ds:schemaRefs>
+    <ds:schemaRef ds:uri="http://schemas.microsoft.com/office/2006/metadata/properties"/>
+    <ds:schemaRef ds:uri="http://schemas.microsoft.com/office/infopath/2007/PartnerControls"/>
+  </ds:schemaRefs>
+</ds:datastoreItem>
 </file>
</xml_diff>